<commit_message>
Add BRD and Technical Document
- BRD v1.1: Feature requirements and gap analysis
- Tech Document (06 May): Technical architecture, stack, database schema, API specifications

Co-Authored-By: Claude Haiku 4.5 <noreply@anthropic.com>
</commit_message>
<xml_diff>
--- a/BRD.docx
+++ b/BRD.docx
@@ -7864,6 +7864,70 @@
           <w:rFonts w:cstheme="minorHAnsi"/>
         </w:rPr>
       </w:pPr>
+      <w:r>
+        <w:rPr>
+          <w:rFonts w:cstheme="minorHAnsi"/>
+        </w:rPr>
+        <w:t>Rule - d</w:t>
+      </w:r>
+      <w:r>
+        <w:rPr>
+          <w:rFonts w:cstheme="minorHAnsi"/>
+        </w:rPr>
+        <w:t>ealer ca</w:t>
+      </w:r>
+      <w:r>
+        <w:rPr>
+          <w:rFonts w:cstheme="minorHAnsi"/>
+        </w:rPr>
+        <w:t>n</w:t>
+      </w:r>
+      <w:r>
+        <w:rPr>
+          <w:rFonts w:cstheme="minorHAnsi"/>
+        </w:rPr>
+        <w:t xml:space="preserve"> </w:t>
+      </w:r>
+      <w:proofErr w:type="spellStart"/>
+      <w:r>
+        <w:rPr>
+          <w:rFonts w:cstheme="minorHAnsi"/>
+        </w:rPr>
+        <w:t>unhold</w:t>
+      </w:r>
+      <w:proofErr w:type="spellEnd"/>
+      <w:r>
+        <w:rPr>
+          <w:rFonts w:cstheme="minorHAnsi"/>
+        </w:rPr>
+        <w:t xml:space="preserve"> the order which the</w:t>
+      </w:r>
+      <w:r>
+        <w:rPr>
+          <w:rFonts w:cstheme="minorHAnsi"/>
+        </w:rPr>
+        <w:t>y</w:t>
+      </w:r>
+      <w:r>
+        <w:rPr>
+          <w:rFonts w:cstheme="minorHAnsi"/>
+        </w:rPr>
+        <w:t xml:space="preserve"> have put on hold. Order put on hold by admin cannot be </w:t>
+      </w:r>
+      <w:proofErr w:type="spellStart"/>
+      <w:r>
+        <w:rPr>
+          <w:rFonts w:cstheme="minorHAnsi"/>
+        </w:rPr>
+        <w:t>unhold</w:t>
+      </w:r>
+      <w:proofErr w:type="spellEnd"/>
+      <w:r>
+        <w:rPr>
+          <w:rFonts w:cstheme="minorHAnsi"/>
+        </w:rPr>
+        <w:t xml:space="preserve"> by dealer</w:t>
+      </w:r>
     </w:p>
     <w:sectPr>
       <w:pgSz w:w="11906" w:h="16838"/>

</xml_diff>